<commit_message>
When an event popup appears, the price for the ticket is visible
</commit_message>
<xml_diff>
--- a/UCI 2123 Capstone Project fixed 1.docx
+++ b/UCI 2123 Capstone Project fixed 1.docx
@@ -10531,4 +10531,10 @@
   </a:objectDefaults>
   <a:extraClrSchemeLst/>
 </a:theme>
+</file>
+
+<file path=docMetadata/LabelInfo.xml><?xml version="1.0" encoding="utf-8"?>
+<clbl:labelList xmlns:clbl="http://schemas.microsoft.com/office/2020/mipLabelMetadata">
+  <clbl:label id="{e0793d39-0939-496d-b129-198edd916feb}" enabled="0" method="" siteId="{e0793d39-0939-496d-b129-198edd916feb}" removed="1"/>
+</clbl:labelList>
 </file>
</xml_diff>

<commit_message>
Updated API documentation and readme
</commit_message>
<xml_diff>
--- a/UCI 2123 Capstone Project fixed 1.docx
+++ b/UCI 2123 Capstone Project fixed 1.docx
@@ -10533,6 +10533,18 @@
 </a:theme>
 </file>
 
+<file path=customXml/item1.xml><?xml version="1.0" encoding="utf-8"?>
+<b:Sources xmlns:b="http://schemas.openxmlformats.org/officeDocument/2006/bibliography" xmlns="http://schemas.openxmlformats.org/officeDocument/2006/bibliography" SelectedStyle="\APASixthEditionOfficeOnline.xsl" StyleName="APA" Version="6"/>
+</file>
+
+<file path=customXml/itemProps1.xml><?xml version="1.0" encoding="utf-8"?>
+<ds:datastoreItem xmlns:ds="http://schemas.openxmlformats.org/officeDocument/2006/customXml" ds:itemID="{9D92B9EC-52F0-432C-8CCE-BD71010A76AE}">
+  <ds:schemaRefs>
+    <ds:schemaRef ds:uri="http://schemas.openxmlformats.org/officeDocument/2006/bibliography"/>
+  </ds:schemaRefs>
+</ds:datastoreItem>
+</file>
+
 <file path=docMetadata/LabelInfo.xml><?xml version="1.0" encoding="utf-8"?>
 <clbl:labelList xmlns:clbl="http://schemas.microsoft.com/office/2020/mipLabelMetadata">
   <clbl:label id="{e0793d39-0939-496d-b129-198edd916feb}" enabled="0" method="" siteId="{e0793d39-0939-496d-b129-198edd916feb}" removed="1"/>

</xml_diff>